<commit_message>
Circuit Lab 1: added pre-lab questions on DMMs
Also tweaked figures to use correct symbol for power supply rather than single battery cell.
</commit_message>
<xml_diff>
--- a/StudentGuideModule2/electric_circuits/circ_diag2.docx
+++ b/StudentGuideModule2/electric_circuits/circ_diag2.docx
@@ -1,10 +1,8 @@
 
 <file path=word/document.xml><?xml version="1.0" encoding="utf-8"?>
-<w:document xmlns:wpc="http://schemas.microsoft.com/office/word/2010/wordprocessingCanvas" xmlns:cx="http://schemas.microsoft.com/office/drawing/2014/chartex" xmlns:cx1="http://schemas.microsoft.com/office/drawing/2015/9/8/chartex" xmlns:mc="http://schemas.openxmlformats.org/markup-compatibility/2006" xmlns:o="urn:schemas-microsoft-com:office:office" xmlns:r="http://schemas.openxmlformats.org/officeDocument/2006/relationships" xmlns:m="http://schemas.openxmlformats.org/officeDocument/2006/math" xmlns:v="urn:schemas-microsoft-com:vml" xmlns:wp14="http://schemas.microsoft.com/office/word/2010/wordprocessingDrawing" xmlns:wp="http://schemas.openxmlformats.org/drawingml/2006/wordprocessingDrawing" xmlns:w10="urn:schemas-microsoft-com:office:word" xmlns:w="http://schemas.openxmlformats.org/wordprocessingml/2006/main" xmlns:w14="http://schemas.microsoft.com/office/word/2010/wordml" xmlns:w15="http://schemas.microsoft.com/office/word/2012/wordml" xmlns:w16se="http://schemas.microsoft.com/office/word/2015/wordml/symex" xmlns:wpg="http://schemas.microsoft.com/office/word/2010/wordprocessingGroup" xmlns:wpi="http://schemas.microsoft.com/office/word/2010/wordprocessingInk" xmlns:wne="http://schemas.microsoft.com/office/word/2006/wordml" xmlns:wps="http://schemas.microsoft.com/office/word/2010/wordprocessingShape" mc:Ignorable="w14 w15 w16se wp14">
+<w:document xmlns:wpc="http://schemas.microsoft.com/office/word/2010/wordprocessingCanvas" xmlns:cx="http://schemas.microsoft.com/office/drawing/2014/chartex" xmlns:cx1="http://schemas.microsoft.com/office/drawing/2015/9/8/chartex" xmlns:cx2="http://schemas.microsoft.com/office/drawing/2015/10/21/chartex" xmlns:cx3="http://schemas.microsoft.com/office/drawing/2016/5/9/chartex" xmlns:cx4="http://schemas.microsoft.com/office/drawing/2016/5/10/chartex" xmlns:cx5="http://schemas.microsoft.com/office/drawing/2016/5/11/chartex" xmlns:cx6="http://schemas.microsoft.com/office/drawing/2016/5/12/chartex" xmlns:cx7="http://schemas.microsoft.com/office/drawing/2016/5/13/chartex" xmlns:cx8="http://schemas.microsoft.com/office/drawing/2016/5/14/chartex" xmlns:mc="http://schemas.openxmlformats.org/markup-compatibility/2006" xmlns:aink="http://schemas.microsoft.com/office/drawing/2016/ink" xmlns:am3d="http://schemas.microsoft.com/office/drawing/2017/model3d" xmlns:o="urn:schemas-microsoft-com:office:office" xmlns:oel="http://schemas.microsoft.com/office/2019/extlst" xmlns:r="http://schemas.openxmlformats.org/officeDocument/2006/relationships" xmlns:m="http://schemas.openxmlformats.org/officeDocument/2006/math" xmlns:v="urn:schemas-microsoft-com:vml" xmlns:wp14="http://schemas.microsoft.com/office/word/2010/wordprocessingDrawing" xmlns:wp="http://schemas.openxmlformats.org/drawingml/2006/wordprocessingDrawing" xmlns:w10="urn:schemas-microsoft-com:office:word" xmlns:w="http://schemas.openxmlformats.org/wordprocessingml/2006/main" xmlns:w14="http://schemas.microsoft.com/office/word/2010/wordml" xmlns:w15="http://schemas.microsoft.com/office/word/2012/wordml" xmlns:w16cex="http://schemas.microsoft.com/office/word/2018/wordml/cex" xmlns:w16cid="http://schemas.microsoft.com/office/word/2016/wordml/cid" xmlns:w16="http://schemas.microsoft.com/office/word/2018/wordml" xmlns:w16du="http://schemas.microsoft.com/office/word/2023/wordml/word16du" xmlns:w16sdtdh="http://schemas.microsoft.com/office/word/2020/wordml/sdtdatahash" xmlns:w16sdtfl="http://schemas.microsoft.com/office/word/2024/wordml/sdtformatlock" xmlns:w16se="http://schemas.microsoft.com/office/word/2015/wordml/symex" xmlns:wpg="http://schemas.microsoft.com/office/word/2010/wordprocessingGroup" xmlns:wpi="http://schemas.microsoft.com/office/word/2010/wordprocessingInk" xmlns:wne="http://schemas.microsoft.com/office/word/2006/wordml" xmlns:wps="http://schemas.microsoft.com/office/word/2010/wordprocessingShape" mc:Ignorable="w14 w15 w16se w16cid w16 w16cex w16sdtdh w16sdtfl w16du wp14">
   <w:body>
     <w:p>
-      <w:bookmarkStart w:id="0" w:name="_GoBack"/>
-      <w:bookmarkEnd w:id="0"/>
       <w:r>
         <w:rPr>
           <w:noProof/>
@@ -12,50 +10,87 @@
         <mc:AlternateContent>
           <mc:Choice Requires="wpg">
             <w:drawing>
-              <wp:anchor distT="0" distB="0" distL="114300" distR="114300" simplePos="0" relativeHeight="251638272" behindDoc="0" locked="0" layoutInCell="1" allowOverlap="1">
+              <wp:anchor distT="0" distB="0" distL="114300" distR="114300" simplePos="0" relativeHeight="251670016" behindDoc="0" locked="0" layoutInCell="1" allowOverlap="1" wp14:anchorId="79A81577" wp14:editId="36C90178">
                 <wp:simplePos x="0" y="0"/>
                 <wp:positionH relativeFrom="column">
-                  <wp:posOffset>1368972</wp:posOffset>
+                  <wp:posOffset>1474470</wp:posOffset>
                 </wp:positionH>
                 <wp:positionV relativeFrom="paragraph">
-                  <wp:posOffset>511788</wp:posOffset>
+                  <wp:posOffset>434340</wp:posOffset>
                 </wp:positionV>
-                <wp:extent cx="485775" cy="97790"/>
-                <wp:effectExtent l="0" t="0" r="28575" b="35560"/>
+                <wp:extent cx="240030" cy="222885"/>
+                <wp:effectExtent l="0" t="0" r="26670" b="43815"/>
                 <wp:wrapNone/>
-                <wp:docPr id="306" name="Group 148"/>
-                <wp:cNvGraphicFramePr>
-                  <a:graphicFrameLocks xmlns:a="http://schemas.openxmlformats.org/drawingml/2006/main"/>
-                </wp:cNvGraphicFramePr>
+                <wp:docPr id="285542912" name="Group 20"/>
+                <wp:cNvGraphicFramePr/>
                 <a:graphic xmlns:a="http://schemas.openxmlformats.org/drawingml/2006/main">
                   <a:graphicData uri="http://schemas.microsoft.com/office/word/2010/wordprocessingGroup">
                     <wpg:wgp>
-                      <wpg:cNvGrpSpPr>
-                        <a:grpSpLocks/>
-                      </wpg:cNvGrpSpPr>
-                      <wpg:grpSpPr bwMode="auto">
+                      <wpg:cNvGrpSpPr/>
+                      <wpg:grpSpPr>
                         <a:xfrm>
                           <a:off x="0" y="0"/>
-                          <a:ext cx="485775" cy="97790"/>
-                          <a:chOff x="3930" y="12735"/>
-                          <a:chExt cx="765" cy="154"/>
+                          <a:ext cx="240030" cy="222885"/>
+                          <a:chOff x="0" y="0"/>
+                          <a:chExt cx="240030" cy="222885"/>
                         </a:xfrm>
                       </wpg:grpSpPr>
                       <wps:wsp>
-                        <wps:cNvPr id="307" name="AutoShape 149"/>
+                        <wps:cNvPr id="161886821" name="Rectangle 16"/>
+                        <wps:cNvSpPr/>
+                        <wps:spPr>
+                          <a:xfrm>
+                            <a:off x="57150" y="64770"/>
+                            <a:ext cx="140970" cy="158115"/>
+                          </a:xfrm>
+                          <a:prstGeom prst="rect">
+                            <a:avLst/>
+                          </a:prstGeom>
+                          <a:solidFill>
+                            <a:schemeClr val="bg1"/>
+                          </a:solidFill>
+                          <a:ln>
+                            <a:noFill/>
+                          </a:ln>
+                        </wps:spPr>
+                        <wps:style>
+                          <a:lnRef idx="2">
+                            <a:schemeClr val="accent1">
+                              <a:shade val="15000"/>
+                            </a:schemeClr>
+                          </a:lnRef>
+                          <a:fillRef idx="1">
+                            <a:schemeClr val="accent1"/>
+                          </a:fillRef>
+                          <a:effectRef idx="0">
+                            <a:schemeClr val="accent1"/>
+                          </a:effectRef>
+                          <a:fontRef idx="minor">
+                            <a:schemeClr val="lt1"/>
+                          </a:fontRef>
+                        </wps:style>
+                        <wps:bodyPr rot="0" spcFirstLastPara="0" vertOverflow="overflow" horzOverflow="overflow" vert="horz" wrap="square" lIns="91440" tIns="45720" rIns="91440" bIns="45720" numCol="1" spcCol="0" rtlCol="0" fromWordArt="0" anchor="ctr" anchorCtr="0" forceAA="0" compatLnSpc="1">
+                          <a:prstTxWarp prst="textNoShape">
+                            <a:avLst/>
+                          </a:prstTxWarp>
+                          <a:noAutofit/>
+                        </wps:bodyPr>
+                      </wps:wsp>
+                      <wps:wsp>
+                        <wps:cNvPr id="1839918727" name="AutoShape 18"/>
                         <wps:cNvCnPr>
                           <a:cxnSpLocks noChangeShapeType="1"/>
                         </wps:cNvCnPr>
                         <wps:spPr bwMode="auto">
                           <a:xfrm>
-                            <a:off x="3930" y="12735"/>
-                            <a:ext cx="765" cy="0"/>
+                            <a:off x="11430" y="167640"/>
+                            <a:ext cx="228600" cy="0"/>
                           </a:xfrm>
                           <a:prstGeom prst="straightConnector1">
                             <a:avLst/>
                           </a:prstGeom>
                           <a:noFill/>
-                          <a:ln w="19050">
+                          <a:ln w="12700">
                             <a:solidFill>
                               <a:srgbClr val="000000"/>
                             </a:solidFill>
@@ -74,20 +109,20 @@
                         <wps:bodyPr/>
                       </wps:wsp>
                       <wps:wsp>
-                        <wps:cNvPr id="308" name="AutoShape 150"/>
+                        <wps:cNvPr id="982000698" name="AutoShape 19"/>
                         <wps:cNvCnPr>
                           <a:cxnSpLocks noChangeShapeType="1"/>
                         </wps:cNvCnPr>
                         <wps:spPr bwMode="auto">
                           <a:xfrm flipV="1">
-                            <a:off x="4196" y="12886"/>
-                            <a:ext cx="199" cy="3"/>
+                            <a:off x="80010" y="220980"/>
+                            <a:ext cx="91440" cy="1014"/>
                           </a:xfrm>
                           <a:prstGeom prst="straightConnector1">
                             <a:avLst/>
                           </a:prstGeom>
                           <a:noFill/>
-                          <a:ln w="19050">
+                          <a:ln w="12700">
                             <a:solidFill>
                               <a:srgbClr val="000000"/>
                             </a:solidFill>
@@ -105,6 +140,148 @@
                         </wps:spPr>
                         <wps:bodyPr/>
                       </wps:wsp>
+                      <wps:wsp>
+                        <wps:cNvPr id="676510980" name="AutoShape 18"/>
+                        <wps:cNvCnPr>
+                          <a:cxnSpLocks noChangeShapeType="1"/>
+                        </wps:cNvCnPr>
+                        <wps:spPr bwMode="auto">
+                          <a:xfrm>
+                            <a:off x="11430" y="64770"/>
+                            <a:ext cx="228600" cy="0"/>
+                          </a:xfrm>
+                          <a:prstGeom prst="straightConnector1">
+                            <a:avLst/>
+                          </a:prstGeom>
+                          <a:noFill/>
+                          <a:ln w="12700">
+                            <a:solidFill>
+                              <a:srgbClr val="000000"/>
+                            </a:solidFill>
+                            <a:round/>
+                            <a:headEnd/>
+                            <a:tailEnd/>
+                          </a:ln>
+                          <a:extLst>
+                            <a:ext uri="{909E8E84-426E-40DD-AFC4-6F175D3DCCD1}">
+                              <a14:hiddenFill xmlns:a14="http://schemas.microsoft.com/office/drawing/2010/main">
+                                <a:noFill/>
+                              </a14:hiddenFill>
+                            </a:ext>
+                          </a:extLst>
+                        </wps:spPr>
+                        <wps:bodyPr/>
+                      </wps:wsp>
+                      <wps:wsp>
+                        <wps:cNvPr id="576231048" name="AutoShape 19"/>
+                        <wps:cNvCnPr>
+                          <a:cxnSpLocks noChangeShapeType="1"/>
+                        </wps:cNvCnPr>
+                        <wps:spPr bwMode="auto">
+                          <a:xfrm flipV="1">
+                            <a:off x="80010" y="114300"/>
+                            <a:ext cx="91440" cy="1014"/>
+                          </a:xfrm>
+                          <a:prstGeom prst="straightConnector1">
+                            <a:avLst/>
+                          </a:prstGeom>
+                          <a:noFill/>
+                          <a:ln w="12700">
+                            <a:solidFill>
+                              <a:srgbClr val="000000"/>
+                            </a:solidFill>
+                            <a:round/>
+                            <a:headEnd/>
+                            <a:tailEnd/>
+                          </a:ln>
+                          <a:extLst>
+                            <a:ext uri="{909E8E84-426E-40DD-AFC4-6F175D3DCCD1}">
+                              <a14:hiddenFill xmlns:a14="http://schemas.microsoft.com/office/drawing/2010/main">
+                                <a:noFill/>
+                              </a14:hiddenFill>
+                            </a:ext>
+                          </a:extLst>
+                        </wps:spPr>
+                        <wps:bodyPr/>
+                      </wps:wsp>
+                      <wpg:grpSp>
+                        <wpg:cNvPr id="242116144" name="plus"/>
+                        <wpg:cNvGrpSpPr/>
+                        <wpg:grpSpPr>
+                          <a:xfrm>
+                            <a:off x="0" y="0"/>
+                            <a:ext cx="45720" cy="45720"/>
+                            <a:chOff x="0" y="0"/>
+                            <a:chExt cx="57150" cy="55245"/>
+                          </a:xfrm>
+                        </wpg:grpSpPr>
+                        <wps:wsp>
+                          <wps:cNvPr id="1378675102" name="Straight Connector 17"/>
+                          <wps:cNvCnPr/>
+                          <wps:spPr>
+                            <a:xfrm>
+                              <a:off x="0" y="26670"/>
+                              <a:ext cx="57150" cy="0"/>
+                            </a:xfrm>
+                            <a:prstGeom prst="line">
+                              <a:avLst/>
+                            </a:prstGeom>
+                            <a:ln w="6350">
+                              <a:solidFill>
+                                <a:schemeClr val="tx1"/>
+                              </a:solidFill>
+                            </a:ln>
+                          </wps:spPr>
+                          <wps:style>
+                            <a:lnRef idx="1">
+                              <a:schemeClr val="accent1"/>
+                            </a:lnRef>
+                            <a:fillRef idx="0">
+                              <a:schemeClr val="accent1"/>
+                            </a:fillRef>
+                            <a:effectRef idx="0">
+                              <a:schemeClr val="accent1"/>
+                            </a:effectRef>
+                            <a:fontRef idx="minor">
+                              <a:schemeClr val="tx1"/>
+                            </a:fontRef>
+                          </wps:style>
+                          <wps:bodyPr/>
+                        </wps:wsp>
+                        <wps:wsp>
+                          <wps:cNvPr id="1182054669" name="Straight Connector 18"/>
+                          <wps:cNvCnPr/>
+                          <wps:spPr>
+                            <a:xfrm>
+                              <a:off x="28575" y="0"/>
+                              <a:ext cx="0" cy="55245"/>
+                            </a:xfrm>
+                            <a:prstGeom prst="line">
+                              <a:avLst/>
+                            </a:prstGeom>
+                            <a:ln w="6350">
+                              <a:solidFill>
+                                <a:schemeClr val="tx1"/>
+                              </a:solidFill>
+                            </a:ln>
+                          </wps:spPr>
+                          <wps:style>
+                            <a:lnRef idx="1">
+                              <a:schemeClr val="accent1"/>
+                            </a:lnRef>
+                            <a:fillRef idx="0">
+                              <a:schemeClr val="accent1"/>
+                            </a:fillRef>
+                            <a:effectRef idx="0">
+                              <a:schemeClr val="accent1"/>
+                            </a:effectRef>
+                            <a:fontRef idx="minor">
+                              <a:schemeClr val="tx1"/>
+                            </a:fontRef>
+                          </wps:style>
+                          <wps:bodyPr/>
+                        </wps:wsp>
+                      </wpg:grpSp>
                     </wpg:wgp>
                   </a:graphicData>
                 </a:graphic>
@@ -113,13 +290,20 @@
           </mc:Choice>
           <mc:Fallback>
             <w:pict>
-              <v:group w14:anchorId="7B6EDFDC" id="Group 148" o:spid="_x0000_s1026" style="position:absolute;margin-left:107.8pt;margin-top:40.3pt;width:38.25pt;height:7.7pt;z-index:251638272" coordorigin="3930,12735" coordsize="765,154" o:gfxdata="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">
+              <v:group w14:anchorId="2618C896" id="Group 20" o:spid="_x0000_s1026" style="position:absolute;margin-left:116.1pt;margin-top:34.2pt;width:18.9pt;height:17.55pt;z-index:251670016" coordsize="240030,222885" o:gfxdata="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">
+                <v:rect id="Rectangle 16" o:spid="_x0000_s1027" style="position:absolute;left:57150;top:64770;width:140970;height:158115;visibility:visible;mso-wrap-style:square;v-text-anchor:middle" o:gfxdata="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" fillcolor="white [3212]" stroked="f" strokeweight="2pt"/>
                 <v:shapetype id="_x0000_t32" coordsize="21600,21600" o:spt="32" o:oned="t" path="m,l21600,21600e" filled="f">
                   <v:path arrowok="t" fillok="f" o:connecttype="none"/>
                   <o:lock v:ext="edit" shapetype="t"/>
                 </v:shapetype>
-                <v:shape id="AutoShape 149" o:spid="_x0000_s1027" type="#_x0000_t32" style="position:absolute;left:3930;top:12735;width:765;height:0;visibility:visible;mso-wrap-style:square" o:connectortype="straight" o:gfxdata="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" strokeweight="1.5pt"/>
-                <v:shape id="AutoShape 150" o:spid="_x0000_s1028" type="#_x0000_t32" style="position:absolute;left:4196;top:12886;width:199;height:3;flip:y;visibility:visible;mso-wrap-style:square" o:connectortype="straight" o:gfxdata="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" strokeweight="1.5pt"/>
+                <v:shape id="AutoShape 18" o:spid="_x0000_s1028" type="#_x0000_t32" style="position:absolute;left:11430;top:167640;width:228600;height:0;visibility:visible;mso-wrap-style:square" o:connectortype="straight" o:gfxdata="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" strokeweight="1pt"/>
+                <v:shape id="AutoShape 19" o:spid="_x0000_s1029" type="#_x0000_t32" style="position:absolute;left:80010;top:220980;width:91440;height:1014;flip:y;visibility:visible;mso-wrap-style:square" o:connectortype="straight" o:gfxdata="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" strokeweight="1pt"/>
+                <v:shape id="AutoShape 18" o:spid="_x0000_s1030" type="#_x0000_t32" style="position:absolute;left:11430;top:64770;width:228600;height:0;visibility:visible;mso-wrap-style:square" o:connectortype="straight" o:gfxdata="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" strokeweight="1pt"/>
+                <v:shape id="AutoShape 19" o:spid="_x0000_s1031" type="#_x0000_t32" style="position:absolute;left:80010;top:114300;width:91440;height:1014;flip:y;visibility:visible;mso-wrap-style:square" o:connectortype="straight" o:gfxdata="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" strokeweight="1pt"/>
+                <v:group id="plus" o:spid="_x0000_s1032" style="position:absolute;width:45720;height:45720" coordsize="57150,55245" o:gfxdata="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">
+                  <v:line id="Straight Connector 17" o:spid="_x0000_s1033" style="position:absolute;visibility:visible;mso-wrap-style:square" from="0,26670" to="57150,26670" o:connectortype="straight" o:gfxdata="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" strokecolor="black [3213]" strokeweight=".5pt"/>
+                  <v:line id="Straight Connector 18" o:spid="_x0000_s1034" style="position:absolute;visibility:visible;mso-wrap-style:square" from="28575,0" to="28575,55245" o:connectortype="straight" o:gfxdata="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" strokecolor="black [3213]" strokeweight=".5pt"/>
+                </v:group>
               </v:group>
             </w:pict>
           </mc:Fallback>
@@ -132,7 +316,7 @@
         <mc:AlternateContent>
           <mc:Choice Requires="wpg">
             <w:drawing>
-              <wp:anchor distT="0" distB="0" distL="114300" distR="114300" simplePos="0" relativeHeight="251639296" behindDoc="0" locked="0" layoutInCell="1" allowOverlap="1">
+              <wp:anchor distT="0" distB="0" distL="114300" distR="114300" simplePos="0" relativeHeight="251639296" behindDoc="0" locked="0" layoutInCell="1" allowOverlap="1" wp14:anchorId="22B05333" wp14:editId="4376C336">
                 <wp:simplePos x="0" y="0"/>
                 <wp:positionH relativeFrom="column">
                   <wp:posOffset>2564677</wp:posOffset>
@@ -406,7 +590,7 @@
           </mc:Choice>
           <mc:Fallback>
             <w:pict>
-              <v:group w14:anchorId="13B4D2BE" id="Group 151" o:spid="_x0000_s1026" style="position:absolute;margin-left:201.95pt;margin-top:35.15pt;width:29pt;height:17.25pt;z-index:251639296" coordorigin="5430,12705" coordsize="580,345" o:gfxdata="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">
+              <v:group w14:anchorId="22B8BB91" id="Group 151" o:spid="_x0000_s1026" style="position:absolute;margin-left:201.95pt;margin-top:35.15pt;width:29pt;height:17.25pt;z-index:251639296" coordorigin="5430,12705" coordsize="580,345" o:gfxdata="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">
                 <v:oval id="Oval 152" o:spid="_x0000_s1027" style="position:absolute;left:5665;top:12705;width:345;height:345;visibility:visible;mso-wrap-style:square;v-text-anchor:top" o:gfxdata="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" strokeweight="1pt"/>
                 <v:shape id="AutoShape 153" o:spid="_x0000_s1028" type="#_x0000_t32" style="position:absolute;left:5430;top:12795;width:375;height:0;visibility:visible;mso-wrap-style:square" o:connectortype="straight" o:gfxdata="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" strokeweight="1pt"/>
                 <v:shape id="AutoShape 154" o:spid="_x0000_s1029" type="#_x0000_t32" style="position:absolute;left:5430;top:12970;width:375;height:0;visibility:visible;mso-wrap-style:square" o:connectortype="straight" o:gfxdata="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" strokeweight="1pt"/>
@@ -425,7 +609,7 @@
         <mc:AlternateContent>
           <mc:Choice Requires="wps">
             <w:drawing>
-              <wp:anchor distT="0" distB="0" distL="114300" distR="114300" simplePos="0" relativeHeight="251640320" behindDoc="0" locked="0" layoutInCell="1" allowOverlap="1">
+              <wp:anchor distT="0" distB="0" distL="114300" distR="114300" simplePos="0" relativeHeight="251640320" behindDoc="0" locked="0" layoutInCell="1" allowOverlap="1" wp14:anchorId="4FFC3B38" wp14:editId="1A78C2C4">
                 <wp:simplePos x="0" y="0"/>
                 <wp:positionH relativeFrom="column">
                   <wp:posOffset>1601382</wp:posOffset>
@@ -532,7 +716,7 @@
         <mc:AlternateContent>
           <mc:Choice Requires="wps">
             <w:drawing>
-              <wp:anchor distT="0" distB="0" distL="114300" distR="114300" simplePos="0" relativeHeight="251641344" behindDoc="0" locked="0" layoutInCell="1" allowOverlap="1">
+              <wp:anchor distT="0" distB="0" distL="114300" distR="114300" simplePos="0" relativeHeight="251641344" behindDoc="0" locked="0" layoutInCell="1" allowOverlap="1" wp14:anchorId="25D49081" wp14:editId="66B85A49">
                 <wp:simplePos x="0" y="0"/>
                 <wp:positionH relativeFrom="column">
                   <wp:posOffset>2184312</wp:posOffset>
@@ -639,7 +823,7 @@
         <mc:AlternateContent>
           <mc:Choice Requires="wps">
             <w:drawing>
-              <wp:anchor distT="0" distB="0" distL="114300" distR="114300" simplePos="0" relativeHeight="251642368" behindDoc="0" locked="0" layoutInCell="1" allowOverlap="1">
+              <wp:anchor distT="0" distB="0" distL="114300" distR="114300" simplePos="0" relativeHeight="251642368" behindDoc="0" locked="0" layoutInCell="1" allowOverlap="1" wp14:anchorId="496C8FEA" wp14:editId="64D9E556">
                 <wp:simplePos x="0" y="0"/>
                 <wp:positionH relativeFrom="column">
                   <wp:posOffset>1605192</wp:posOffset>
@@ -746,7 +930,7 @@
         <mc:AlternateContent>
           <mc:Choice Requires="wps">
             <w:drawing>
-              <wp:anchor distT="0" distB="0" distL="114300" distR="114300" simplePos="0" relativeHeight="251643392" behindDoc="0" locked="0" layoutInCell="1" allowOverlap="1">
+              <wp:anchor distT="0" distB="0" distL="114300" distR="114300" simplePos="0" relativeHeight="251643392" behindDoc="0" locked="0" layoutInCell="1" allowOverlap="1" wp14:anchorId="16401293" wp14:editId="33154E52">
                 <wp:simplePos x="0" y="0"/>
                 <wp:positionH relativeFrom="column">
                   <wp:posOffset>2188122</wp:posOffset>
@@ -853,7 +1037,7 @@
         <mc:AlternateContent>
           <mc:Choice Requires="wps">
             <w:drawing>
-              <wp:anchor distT="0" distB="0" distL="114300" distR="114300" simplePos="0" relativeHeight="251644416" behindDoc="0" locked="0" layoutInCell="1" allowOverlap="1">
+              <wp:anchor distT="0" distB="0" distL="114300" distR="114300" simplePos="0" relativeHeight="251644416" behindDoc="0" locked="0" layoutInCell="1" allowOverlap="1" wp14:anchorId="536A6D1D" wp14:editId="34E8DCC2">
                 <wp:simplePos x="0" y="0"/>
                 <wp:positionH relativeFrom="column">
                   <wp:posOffset>1579792</wp:posOffset>
@@ -927,7 +1111,7 @@
         <mc:AlternateContent>
           <mc:Choice Requires="wps">
             <w:drawing>
-              <wp:anchor distT="0" distB="0" distL="114300" distR="114300" simplePos="0" relativeHeight="251645440" behindDoc="0" locked="0" layoutInCell="1" allowOverlap="1">
+              <wp:anchor distT="0" distB="0" distL="114300" distR="114300" simplePos="0" relativeHeight="251645440" behindDoc="0" locked="0" layoutInCell="1" allowOverlap="1" wp14:anchorId="6469D58B" wp14:editId="4B3211E2">
                 <wp:simplePos x="0" y="0"/>
                 <wp:positionH relativeFrom="column">
                   <wp:posOffset>2541817</wp:posOffset>
@@ -1001,7 +1185,7 @@
         <mc:AlternateContent>
           <mc:Choice Requires="wps">
             <w:drawing>
-              <wp:anchor distT="0" distB="0" distL="114300" distR="114300" simplePos="0" relativeHeight="251646464" behindDoc="0" locked="0" layoutInCell="1" allowOverlap="1">
+              <wp:anchor distT="0" distB="0" distL="114300" distR="114300" simplePos="0" relativeHeight="251646464" behindDoc="0" locked="0" layoutInCell="1" allowOverlap="1" wp14:anchorId="5AE4E384" wp14:editId="19F925AF">
                 <wp:simplePos x="0" y="0"/>
                 <wp:positionH relativeFrom="column">
                   <wp:posOffset>1580427</wp:posOffset>
@@ -1075,7 +1259,7 @@
         <mc:AlternateContent>
           <mc:Choice Requires="wps">
             <w:drawing>
-              <wp:anchor distT="0" distB="0" distL="114300" distR="114300" simplePos="0" relativeHeight="251647488" behindDoc="0" locked="0" layoutInCell="1" allowOverlap="1">
+              <wp:anchor distT="0" distB="0" distL="114300" distR="114300" simplePos="0" relativeHeight="251647488" behindDoc="0" locked="0" layoutInCell="1" allowOverlap="1" wp14:anchorId="06275F2E" wp14:editId="2F7B0875">
                 <wp:simplePos x="0" y="0"/>
                 <wp:positionH relativeFrom="column">
                   <wp:posOffset>2544992</wp:posOffset>
@@ -1149,7 +1333,7 @@
         <mc:AlternateContent>
           <mc:Choice Requires="wps">
             <w:drawing>
-              <wp:anchor distT="0" distB="0" distL="114300" distR="114300" simplePos="0" relativeHeight="251648512" behindDoc="0" locked="0" layoutInCell="1" allowOverlap="1">
+              <wp:anchor distT="0" distB="0" distL="114300" distR="114300" simplePos="0" relativeHeight="251648512" behindDoc="0" locked="0" layoutInCell="1" allowOverlap="1" wp14:anchorId="1E003271" wp14:editId="089BECE6">
                 <wp:simplePos x="0" y="0"/>
                 <wp:positionH relativeFrom="column">
                   <wp:posOffset>1525817</wp:posOffset>
@@ -1205,11 +1389,9 @@
                       <wps:txbx>
                         <w:txbxContent>
                           <w:p>
-                            <w:proofErr w:type="gramStart"/>
                             <w:r>
                               <w:t>a</w:t>
                             </w:r>
-                            <w:proofErr w:type="gramEnd"/>
                           </w:p>
                         </w:txbxContent>
                       </wps:txbx>
@@ -1252,7 +1434,7 @@
         <mc:AlternateContent>
           <mc:Choice Requires="wps">
             <w:drawing>
-              <wp:anchor distT="0" distB="0" distL="114300" distR="114300" simplePos="0" relativeHeight="251649536" behindDoc="0" locked="0" layoutInCell="1" allowOverlap="1">
+              <wp:anchor distT="0" distB="0" distL="114300" distR="114300" simplePos="0" relativeHeight="251649536" behindDoc="0" locked="0" layoutInCell="1" allowOverlap="1" wp14:anchorId="60DBF0D8" wp14:editId="70B37EA2">
                 <wp:simplePos x="0" y="0"/>
                 <wp:positionH relativeFrom="column">
                   <wp:posOffset>1506855</wp:posOffset>
@@ -1308,11 +1490,9 @@
                       <wps:txbx>
                         <w:txbxContent>
                           <w:p>
-                            <w:proofErr w:type="gramStart"/>
                             <w:r>
                               <w:t>b</w:t>
                             </w:r>
-                            <w:proofErr w:type="gramEnd"/>
                           </w:p>
                         </w:txbxContent>
                       </wps:txbx>
@@ -1351,7 +1531,7 @@
         <mc:AlternateContent>
           <mc:Choice Requires="wps">
             <w:drawing>
-              <wp:anchor distT="0" distB="0" distL="114300" distR="114300" simplePos="0" relativeHeight="251650560" behindDoc="0" locked="0" layoutInCell="1" allowOverlap="1">
+              <wp:anchor distT="0" distB="0" distL="114300" distR="114300" simplePos="0" relativeHeight="251650560" behindDoc="0" locked="0" layoutInCell="1" allowOverlap="1" wp14:anchorId="310E09D5" wp14:editId="029C0953">
                 <wp:simplePos x="0" y="0"/>
                 <wp:positionH relativeFrom="column">
                   <wp:posOffset>2498725</wp:posOffset>
@@ -1407,11 +1587,9 @@
                       <wps:txbx>
                         <w:txbxContent>
                           <w:p>
-                            <w:proofErr w:type="gramStart"/>
                             <w:r>
                               <w:t>c</w:t>
                             </w:r>
-                            <w:proofErr w:type="gramEnd"/>
                           </w:p>
                         </w:txbxContent>
                       </wps:txbx>
@@ -1450,7 +1628,7 @@
         <mc:AlternateContent>
           <mc:Choice Requires="wps">
             <w:drawing>
-              <wp:anchor distT="0" distB="0" distL="114300" distR="114300" simplePos="0" relativeHeight="251651584" behindDoc="0" locked="0" layoutInCell="1" allowOverlap="1">
+              <wp:anchor distT="0" distB="0" distL="114300" distR="114300" simplePos="0" relativeHeight="251651584" behindDoc="0" locked="0" layoutInCell="1" allowOverlap="1" wp14:anchorId="371E5992" wp14:editId="225EF429">
                 <wp:simplePos x="0" y="0"/>
                 <wp:positionH relativeFrom="column">
                   <wp:posOffset>2498725</wp:posOffset>
@@ -1506,11 +1684,9 @@
                       <wps:txbx>
                         <w:txbxContent>
                           <w:p>
-                            <w:proofErr w:type="gramStart"/>
                             <w:r>
                               <w:t>d</w:t>
                             </w:r>
-                            <w:proofErr w:type="gramEnd"/>
                           </w:p>
                         </w:txbxContent>
                       </wps:txbx>
@@ -1619,7 +1795,7 @@
         <mc:AlternateContent>
           <mc:Choice Requires="wps">
             <w:drawing>
-              <wp:anchor distT="0" distB="0" distL="114300" distR="114300" simplePos="0" relativeHeight="251667968" behindDoc="0" locked="0" layoutInCell="1" allowOverlap="1">
+              <wp:anchor distT="0" distB="0" distL="114300" distR="114300" simplePos="0" relativeHeight="251667968" behindDoc="0" locked="0" layoutInCell="1" allowOverlap="1" wp14:anchorId="2FC98344" wp14:editId="60BD8E49">
                 <wp:simplePos x="0" y="0"/>
                 <wp:positionH relativeFrom="column">
                   <wp:posOffset>1445683</wp:posOffset>
@@ -1848,7 +2024,7 @@
         <mc:AlternateContent>
           <mc:Choice Requires="wpg">
             <w:drawing>
-              <wp:anchor distT="0" distB="0" distL="114300" distR="114300" simplePos="0" relativeHeight="251655680" behindDoc="0" locked="0" layoutInCell="1" allowOverlap="1">
+              <wp:anchor distT="0" distB="0" distL="114300" distR="114300" simplePos="0" relativeHeight="251655680" behindDoc="0" locked="0" layoutInCell="1" allowOverlap="1" wp14:anchorId="63086467" wp14:editId="5400B41C">
                 <wp:simplePos x="0" y="0"/>
                 <wp:positionH relativeFrom="column">
                   <wp:posOffset>836083</wp:posOffset>
@@ -2098,25 +2274,7 @@
                                   <w:sz w:val="20"/>
                                   <w:szCs w:val="20"/>
                                 </w:rPr>
-                                <w:t xml:space="preserve">Measuring potential difference between points </w:t>
-                              </w:r>
-                              <w:proofErr w:type="gramStart"/>
-                              <w:r>
-                                <w:rPr>
-                                  <w:i/>
-                                  <w:sz w:val="20"/>
-                                  <w:szCs w:val="20"/>
-                                </w:rPr>
-                                <w:t>a and</w:t>
-                              </w:r>
-                              <w:proofErr w:type="gramEnd"/>
-                              <w:r>
-                                <w:rPr>
-                                  <w:i/>
-                                  <w:sz w:val="20"/>
-                                  <w:szCs w:val="20"/>
-                                </w:rPr>
-                                <w:t xml:space="preserve"> b.</w:t>
+                                <w:t>Measuring potential difference between points a and b.</w:t>
                               </w:r>
                             </w:p>
                           </w:txbxContent>
@@ -2362,8 +2520,46 @@
 </w:document>
 </file>
 
+<file path=word/endnotes.xml><?xml version="1.0" encoding="utf-8"?>
+<w:endnotes xmlns:wpc="http://schemas.microsoft.com/office/word/2010/wordprocessingCanvas" xmlns:cx="http://schemas.microsoft.com/office/drawing/2014/chartex" xmlns:cx1="http://schemas.microsoft.com/office/drawing/2015/9/8/chartex" xmlns:cx2="http://schemas.microsoft.com/office/drawing/2015/10/21/chartex" xmlns:cx3="http://schemas.microsoft.com/office/drawing/2016/5/9/chartex" xmlns:cx4="http://schemas.microsoft.com/office/drawing/2016/5/10/chartex" xmlns:cx5="http://schemas.microsoft.com/office/drawing/2016/5/11/chartex" xmlns:cx6="http://schemas.microsoft.com/office/drawing/2016/5/12/chartex" xmlns:cx7="http://schemas.microsoft.com/office/drawing/2016/5/13/chartex" xmlns:cx8="http://schemas.microsoft.com/office/drawing/2016/5/14/chartex" xmlns:mc="http://schemas.openxmlformats.org/markup-compatibility/2006" xmlns:aink="http://schemas.microsoft.com/office/drawing/2016/ink" xmlns:am3d="http://schemas.microsoft.com/office/drawing/2017/model3d" xmlns:o="urn:schemas-microsoft-com:office:office" xmlns:oel="http://schemas.microsoft.com/office/2019/extlst" xmlns:r="http://schemas.openxmlformats.org/officeDocument/2006/relationships" xmlns:m="http://schemas.openxmlformats.org/officeDocument/2006/math" xmlns:v="urn:schemas-microsoft-com:vml" xmlns:wp14="http://schemas.microsoft.com/office/word/2010/wordprocessingDrawing" xmlns:wp="http://schemas.openxmlformats.org/drawingml/2006/wordprocessingDrawing" xmlns:w10="urn:schemas-microsoft-com:office:word" xmlns:w="http://schemas.openxmlformats.org/wordprocessingml/2006/main" xmlns:w14="http://schemas.microsoft.com/office/word/2010/wordml" xmlns:w15="http://schemas.microsoft.com/office/word/2012/wordml" xmlns:w16cex="http://schemas.microsoft.com/office/word/2018/wordml/cex" xmlns:w16cid="http://schemas.microsoft.com/office/word/2016/wordml/cid" xmlns:w16="http://schemas.microsoft.com/office/word/2018/wordml" xmlns:w16du="http://schemas.microsoft.com/office/word/2023/wordml/word16du" xmlns:w16sdtdh="http://schemas.microsoft.com/office/word/2020/wordml/sdtdatahash" xmlns:w16sdtfl="http://schemas.microsoft.com/office/word/2024/wordml/sdtformatlock" xmlns:w16se="http://schemas.microsoft.com/office/word/2015/wordml/symex" xmlns:wpg="http://schemas.microsoft.com/office/word/2010/wordprocessingGroup" xmlns:wpi="http://schemas.microsoft.com/office/word/2010/wordprocessingInk" xmlns:wne="http://schemas.microsoft.com/office/word/2006/wordml" xmlns:wps="http://schemas.microsoft.com/office/word/2010/wordprocessingShape" mc:Ignorable="w14 w15 w16se w16cid w16 w16cex w16sdtdh w16sdtfl w16du wp14">
+  <w:endnote w:type="separator" w:id="-1">
+    <w:p>
+      <w:r>
+        <w:separator/>
+      </w:r>
+    </w:p>
+  </w:endnote>
+  <w:endnote w:type="continuationSeparator" w:id="0">
+    <w:p>
+      <w:r>
+        <w:continuationSeparator/>
+      </w:r>
+    </w:p>
+  </w:endnote>
+</w:endnotes>
+</file>
+
+<file path=word/footnotes.xml><?xml version="1.0" encoding="utf-8"?>
+<w:footnotes xmlns:wpc="http://schemas.microsoft.com/office/word/2010/wordprocessingCanvas" xmlns:cx="http://schemas.microsoft.com/office/drawing/2014/chartex" xmlns:cx1="http://schemas.microsoft.com/office/drawing/2015/9/8/chartex" xmlns:cx2="http://schemas.microsoft.com/office/drawing/2015/10/21/chartex" xmlns:cx3="http://schemas.microsoft.com/office/drawing/2016/5/9/chartex" xmlns:cx4="http://schemas.microsoft.com/office/drawing/2016/5/10/chartex" xmlns:cx5="http://schemas.microsoft.com/office/drawing/2016/5/11/chartex" xmlns:cx6="http://schemas.microsoft.com/office/drawing/2016/5/12/chartex" xmlns:cx7="http://schemas.microsoft.com/office/drawing/2016/5/13/chartex" xmlns:cx8="http://schemas.microsoft.com/office/drawing/2016/5/14/chartex" xmlns:mc="http://schemas.openxmlformats.org/markup-compatibility/2006" xmlns:aink="http://schemas.microsoft.com/office/drawing/2016/ink" xmlns:am3d="http://schemas.microsoft.com/office/drawing/2017/model3d" xmlns:o="urn:schemas-microsoft-com:office:office" xmlns:oel="http://schemas.microsoft.com/office/2019/extlst" xmlns:r="http://schemas.openxmlformats.org/officeDocument/2006/relationships" xmlns:m="http://schemas.openxmlformats.org/officeDocument/2006/math" xmlns:v="urn:schemas-microsoft-com:vml" xmlns:wp14="http://schemas.microsoft.com/office/word/2010/wordprocessingDrawing" xmlns:wp="http://schemas.openxmlformats.org/drawingml/2006/wordprocessingDrawing" xmlns:w10="urn:schemas-microsoft-com:office:word" xmlns:w="http://schemas.openxmlformats.org/wordprocessingml/2006/main" xmlns:w14="http://schemas.microsoft.com/office/word/2010/wordml" xmlns:w15="http://schemas.microsoft.com/office/word/2012/wordml" xmlns:w16cex="http://schemas.microsoft.com/office/word/2018/wordml/cex" xmlns:w16cid="http://schemas.microsoft.com/office/word/2016/wordml/cid" xmlns:w16="http://schemas.microsoft.com/office/word/2018/wordml" xmlns:w16du="http://schemas.microsoft.com/office/word/2023/wordml/word16du" xmlns:w16sdtdh="http://schemas.microsoft.com/office/word/2020/wordml/sdtdatahash" xmlns:w16sdtfl="http://schemas.microsoft.com/office/word/2024/wordml/sdtformatlock" xmlns:w16se="http://schemas.microsoft.com/office/word/2015/wordml/symex" xmlns:wpg="http://schemas.microsoft.com/office/word/2010/wordprocessingGroup" xmlns:wpi="http://schemas.microsoft.com/office/word/2010/wordprocessingInk" xmlns:wne="http://schemas.microsoft.com/office/word/2006/wordml" xmlns:wps="http://schemas.microsoft.com/office/word/2010/wordprocessingShape" mc:Ignorable="w14 w15 w16se w16cid w16 w16cex w16sdtdh w16sdtfl w16du wp14">
+  <w:footnote w:type="separator" w:id="-1">
+    <w:p>
+      <w:r>
+        <w:separator/>
+      </w:r>
+    </w:p>
+  </w:footnote>
+  <w:footnote w:type="continuationSeparator" w:id="0">
+    <w:p>
+      <w:r>
+        <w:continuationSeparator/>
+      </w:r>
+    </w:p>
+  </w:footnote>
+</w:footnotes>
+</file>
+
 <file path=word/styles.xml><?xml version="1.0" encoding="utf-8"?>
-<w:styles xmlns:mc="http://schemas.openxmlformats.org/markup-compatibility/2006" xmlns:r="http://schemas.openxmlformats.org/officeDocument/2006/relationships" xmlns:w="http://schemas.openxmlformats.org/wordprocessingml/2006/main" xmlns:w14="http://schemas.microsoft.com/office/word/2010/wordml" xmlns:w15="http://schemas.microsoft.com/office/word/2012/wordml" xmlns:w16se="http://schemas.microsoft.com/office/word/2015/wordml/symex" mc:Ignorable="w14 w15 w16se">
+<w:styles xmlns:mc="http://schemas.openxmlformats.org/markup-compatibility/2006" xmlns:r="http://schemas.openxmlformats.org/officeDocument/2006/relationships" xmlns:w="http://schemas.openxmlformats.org/wordprocessingml/2006/main" xmlns:w14="http://schemas.microsoft.com/office/word/2010/wordml" xmlns:w15="http://schemas.microsoft.com/office/word/2012/wordml" xmlns:w16cex="http://schemas.microsoft.com/office/word/2018/wordml/cex" xmlns:w16cid="http://schemas.microsoft.com/office/word/2016/wordml/cid" xmlns:w16="http://schemas.microsoft.com/office/word/2018/wordml" xmlns:w16du="http://schemas.microsoft.com/office/word/2023/wordml/word16du" xmlns:w16sdtdh="http://schemas.microsoft.com/office/word/2020/wordml/sdtdatahash" xmlns:w16sdtfl="http://schemas.microsoft.com/office/word/2024/wordml/sdtformatlock" xmlns:w16se="http://schemas.microsoft.com/office/word/2015/wordml/symex" mc:Ignorable="w14 w15 w16se w16cid w16 w16cex w16sdtdh w16sdtfl w16du">
   <w:docDefaults>
     <w:rPrDefault>
       <w:rPr>
@@ -2379,7 +2575,7 @@
       </w:pPr>
     </w:pPrDefault>
   </w:docDefaults>
-  <w:latentStyles w:defLockedState="0" w:defUIPriority="99" w:defSemiHidden="0" w:defUnhideWhenUsed="0" w:defQFormat="0" w:count="371">
+  <w:latentStyles w:defLockedState="0" w:defUIPriority="99" w:defSemiHidden="0" w:defUnhideWhenUsed="0" w:defQFormat="0" w:count="376">
     <w:lsdException w:name="Normal" w:uiPriority="0" w:qFormat="1"/>
     <w:lsdException w:name="heading 1" w:uiPriority="9" w:qFormat="1"/>
     <w:lsdException w:name="heading 2" w:semiHidden="1" w:uiPriority="9" w:unhideWhenUsed="1" w:qFormat="1"/>
@@ -2751,6 +2947,11 @@
     <w:lsdException w:name="List Table 5 Dark Accent 6" w:uiPriority="50"/>
     <w:lsdException w:name="List Table 6 Colorful Accent 6" w:uiPriority="51"/>
     <w:lsdException w:name="List Table 7 Colorful Accent 6" w:uiPriority="52"/>
+    <w:lsdException w:name="Mention" w:semiHidden="1" w:unhideWhenUsed="1"/>
+    <w:lsdException w:name="Smart Hyperlink" w:semiHidden="1" w:unhideWhenUsed="1"/>
+    <w:lsdException w:name="Hashtag" w:semiHidden="1" w:unhideWhenUsed="1"/>
+    <w:lsdException w:name="Unresolved Mention" w:semiHidden="1" w:unhideWhenUsed="1"/>
+    <w:lsdException w:name="Smart Link" w:semiHidden="1" w:unhideWhenUsed="1"/>
   </w:latentStyles>
   <w:style w:type="paragraph" w:default="1" w:styleId="Normal">
     <w:name w:val="Normal"/>
@@ -2791,6 +2992,58 @@
     <w:uiPriority w:val="99"/>
     <w:semiHidden/>
     <w:unhideWhenUsed/>
+  </w:style>
+  <w:style w:type="paragraph" w:styleId="Header">
+    <w:name w:val="header"/>
+    <w:basedOn w:val="Normal"/>
+    <w:link w:val="HeaderChar"/>
+    <w:uiPriority w:val="99"/>
+    <w:unhideWhenUsed/>
+    <w:rsid w:val="00A533D2"/>
+    <w:pPr>
+      <w:tabs>
+        <w:tab w:val="center" w:pos="4680"/>
+        <w:tab w:val="right" w:pos="9360"/>
+      </w:tabs>
+    </w:pPr>
+  </w:style>
+  <w:style w:type="character" w:customStyle="1" w:styleId="HeaderChar">
+    <w:name w:val="Header Char"/>
+    <w:basedOn w:val="DefaultParagraphFont"/>
+    <w:link w:val="Header"/>
+    <w:uiPriority w:val="99"/>
+    <w:rsid w:val="00A533D2"/>
+    <w:rPr>
+      <w:rFonts w:ascii="Times New Roman" w:eastAsia="Times New Roman" w:hAnsi="Times New Roman" w:cs="Times New Roman"/>
+      <w:sz w:val="24"/>
+      <w:szCs w:val="24"/>
+    </w:rPr>
+  </w:style>
+  <w:style w:type="paragraph" w:styleId="Footer">
+    <w:name w:val="footer"/>
+    <w:basedOn w:val="Normal"/>
+    <w:link w:val="FooterChar"/>
+    <w:uiPriority w:val="99"/>
+    <w:unhideWhenUsed/>
+    <w:rsid w:val="00A533D2"/>
+    <w:pPr>
+      <w:tabs>
+        <w:tab w:val="center" w:pos="4680"/>
+        <w:tab w:val="right" w:pos="9360"/>
+      </w:tabs>
+    </w:pPr>
+  </w:style>
+  <w:style w:type="character" w:customStyle="1" w:styleId="FooterChar">
+    <w:name w:val="Footer Char"/>
+    <w:basedOn w:val="DefaultParagraphFont"/>
+    <w:link w:val="Footer"/>
+    <w:uiPriority w:val="99"/>
+    <w:rsid w:val="00A533D2"/>
+    <w:rPr>
+      <w:rFonts w:ascii="Times New Roman" w:eastAsia="Times New Roman" w:hAnsi="Times New Roman" w:cs="Times New Roman"/>
+      <w:sz w:val="24"/>
+      <w:szCs w:val="24"/>
+    </w:rPr>
   </w:style>
 </w:styles>
 </file>

</xml_diff>